<commit_message>
Images Added and CV Updated
</commit_message>
<xml_diff>
--- a/documents/Simon_Hartmann_CV.docx
+++ b/documents/Simon_Hartmann_CV.docx
@@ -12,6 +12,58 @@
       </w:pPr>
       <w:r>
         <w:rPr>
+          <w:noProof/>
+        </w:rPr>
+        <w:drawing>
+          <wp:anchor distT="0" distB="0" distL="114300" distR="114300" simplePos="0" relativeHeight="251659264" behindDoc="0" locked="0" layoutInCell="1" allowOverlap="1" wp14:anchorId="54AB3854" wp14:editId="034B067C">
+            <wp:simplePos x="0" y="0"/>
+            <wp:positionH relativeFrom="column">
+              <wp:posOffset>4311015</wp:posOffset>
+            </wp:positionH>
+            <wp:positionV relativeFrom="paragraph">
+              <wp:posOffset>-3809</wp:posOffset>
+            </wp:positionV>
+            <wp:extent cx="1628775" cy="2476500"/>
+            <wp:effectExtent l="0" t="0" r="9525" b="0"/>
+            <wp:wrapNone/>
+            <wp:docPr id="185" name="Picture 1"/>
+            <wp:cNvGraphicFramePr/>
+            <a:graphic xmlns:a="http://schemas.openxmlformats.org/drawingml/2006/main">
+              <a:graphicData uri="http://schemas.openxmlformats.org/drawingml/2006/picture">
+                <pic:pic xmlns:pic="http://schemas.openxmlformats.org/drawingml/2006/picture">
+                  <pic:nvPicPr>
+                    <pic:cNvPr id="185" name="Picture 185"/>
+                    <pic:cNvPicPr/>
+                  </pic:nvPicPr>
+                  <pic:blipFill>
+                    <a:blip r:embed="rId5"/>
+                    <a:stretch>
+                      <a:fillRect/>
+                    </a:stretch>
+                  </pic:blipFill>
+                  <pic:spPr>
+                    <a:xfrm>
+                      <a:off x="0" y="0"/>
+                      <a:ext cx="1629345" cy="2477367"/>
+                    </a:xfrm>
+                    <a:prstGeom prst="rect">
+                      <a:avLst/>
+                    </a:prstGeom>
+                  </pic:spPr>
+                </pic:pic>
+              </a:graphicData>
+            </a:graphic>
+            <wp14:sizeRelH relativeFrom="margin">
+              <wp14:pctWidth>0</wp14:pctWidth>
+            </wp14:sizeRelH>
+            <wp14:sizeRelV relativeFrom="margin">
+              <wp14:pctHeight>0</wp14:pctHeight>
+            </wp14:sizeRelV>
+          </wp:anchor>
+        </w:drawing>
+      </w:r>
+      <w:r>
+        <w:rPr>
           <w:b/>
           <w:bCs/>
           <w:lang w:val="en-US"/>
@@ -46,7 +98,7 @@
         </w:rPr>
         <w:t xml:space="preserve">Aachen, Germany · </w:t>
       </w:r>
-      <w:hyperlink r:id="rId5" w:history="1">
+      <w:hyperlink r:id="rId6" w:history="1">
         <w:r>
           <w:rPr>
             <w:rStyle w:val="Hyperlink"/>
@@ -75,27 +127,13 @@
         </w:rPr>
         <w:t xml:space="preserve"> </w:t>
       </w:r>
-      <w:hyperlink r:id="rId6" w:history="1">
+      <w:hyperlink r:id="rId7" w:history="1">
         <w:r>
           <w:rPr>
             <w:rStyle w:val="Hyperlink"/>
             <w:lang w:val="en-US"/>
           </w:rPr>
-          <w:t>simonhartmann</w:t>
-        </w:r>
-        <w:r>
-          <w:rPr>
-            <w:rStyle w:val="Hyperlink"/>
-            <w:lang w:val="en-US"/>
-          </w:rPr>
-          <w:t>d</w:t>
-        </w:r>
-        <w:r>
-          <w:rPr>
-            <w:rStyle w:val="Hyperlink"/>
-            <w:lang w:val="en-US"/>
-          </w:rPr>
-          <w:t>ev.github.io</w:t>
+          <w:t>simonhartmanndev.github.io</w:t>
         </w:r>
       </w:hyperlink>
       <w:r>
@@ -118,7 +156,7 @@
         </w:rPr>
         <w:t xml:space="preserve"> </w:t>
       </w:r>
-      <w:hyperlink r:id="rId7" w:history="1">
+      <w:hyperlink r:id="rId8" w:history="1">
         <w:r>
           <w:rPr>
             <w:rStyle w:val="Hyperlink"/>
@@ -140,7 +178,7 @@
     <w:p>
       <w:r>
         <w:pict w14:anchorId="1A41A342">
-          <v:rect id="_x0000_i1061" style="width:0;height:1.5pt" o:hralign="center" o:hrstd="t" o:hr="t" fillcolor="#a0a0a0" stroked="f"/>
+          <v:rect id="_x0000_i1025" style="width:0;height:1.5pt" o:hralign="center" o:hrstd="t" o:hr="t" fillcolor="#a0a0a0" stroked="f"/>
         </w:pict>
       </w:r>
     </w:p>
@@ -204,7 +242,7 @@
     <w:p>
       <w:r>
         <w:pict w14:anchorId="6320E920">
-          <v:rect id="_x0000_i1062" style="width:0;height:1.5pt" o:hralign="center" o:hrstd="t" o:hr="t" fillcolor="#a0a0a0" stroked="f"/>
+          <v:rect id="_x0000_i1026" style="width:0;height:1.5pt" o:hralign="center" o:hrstd="t" o:hr="t" fillcolor="#a0a0a0" stroked="f"/>
         </w:pict>
       </w:r>
     </w:p>
@@ -433,21 +471,7 @@
         <w:rPr>
           <w:lang w:val="en-US"/>
         </w:rPr>
-        <w:t xml:space="preserve">, currency and character </w:t>
-      </w:r>
-      <w:proofErr w:type="gramStart"/>
-      <w:r>
-        <w:rPr>
-          <w:lang w:val="en-US"/>
-        </w:rPr>
-        <w:t>unlocks</w:t>
-      </w:r>
-      <w:proofErr w:type="gramEnd"/>
-      <w:r>
-        <w:rPr>
-          <w:lang w:val="en-US"/>
-        </w:rPr>
-        <w:t>.</w:t>
+        <w:t>, currency and character unlocks.</w:t>
       </w:r>
     </w:p>
     <w:p>
@@ -609,26 +633,54 @@
       </w:r>
     </w:p>
     <w:p>
+      <w:pPr>
+        <w:rPr>
+          <w:b/>
+          <w:bCs/>
+          <w:lang w:val="en-US"/>
+        </w:rPr>
+      </w:pPr>
       <w:r>
         <w:pict w14:anchorId="009C5BC7">
-          <v:rect id="_x0000_i1063" style="width:0;height:1.5pt" o:hralign="center" o:hrstd="t" o:hr="t" fillcolor="#a0a0a0" stroked="f"/>
+          <v:rect id="_x0000_i1027" style="width:0;height:1.5pt" o:hralign="center" o:hrstd="t" o:hr="t" fillcolor="#a0a0a0" stroked="f"/>
         </w:pict>
       </w:r>
-    </w:p>
-    <w:p>
-      <w:pPr>
-        <w:rPr>
-          <w:b/>
-          <w:bCs/>
-          <w:lang w:val="en-US"/>
-        </w:rPr>
-      </w:pPr>
-      <w:r>
-        <w:rPr>
-          <w:b/>
-          <w:bCs/>
-          <w:lang w:val="en-US"/>
-        </w:rPr>
+      <w:r>
+        <w:rPr>
+          <w:b/>
+          <w:bCs/>
+          <w:lang w:val="en-US"/>
+        </w:rPr>
+        <w:br/>
+      </w:r>
+    </w:p>
+    <w:p>
+      <w:pPr>
+        <w:spacing w:after="160" w:line="278" w:lineRule="auto"/>
+        <w:ind w:left="0" w:firstLine="0"/>
+        <w:rPr>
+          <w:b/>
+          <w:bCs/>
+          <w:lang w:val="en-US"/>
+        </w:rPr>
+      </w:pPr>
+      <w:r>
+        <w:rPr>
+          <w:b/>
+          <w:bCs/>
+          <w:lang w:val="en-US"/>
+        </w:rPr>
+        <w:br w:type="page"/>
+      </w:r>
+    </w:p>
+    <w:p>
+      <w:r>
+        <w:rPr>
+          <w:b/>
+          <w:bCs/>
+          <w:lang w:val="en-US"/>
+        </w:rPr>
+        <w:lastRenderedPageBreak/>
         <w:t>EXPERIENCE</w:t>
       </w:r>
     </w:p>
@@ -646,7 +698,6 @@
           <w:bCs/>
           <w:lang w:val="en-US"/>
         </w:rPr>
-        <w:lastRenderedPageBreak/>
         <w:t>Board Member / Server Administration</w:t>
       </w:r>
     </w:p>
@@ -977,7 +1028,7 @@
     <w:p>
       <w:r>
         <w:pict w14:anchorId="09798B08">
-          <v:rect id="_x0000_i1064" style="width:0;height:1.5pt" o:hralign="center" o:hrstd="t" o:hr="t" fillcolor="#a0a0a0" stroked="f"/>
+          <v:rect id="_x0000_i1028" style="width:0;height:1.5pt" o:hralign="center" o:hrstd="t" o:hr="t" fillcolor="#a0a0a0" stroked="f"/>
         </w:pict>
       </w:r>
     </w:p>
@@ -1067,24 +1118,44 @@
     <w:p>
       <w:r>
         <w:pict w14:anchorId="16D76C0E">
-          <v:rect id="_x0000_i1065" style="width:0;height:1.5pt" o:hralign="center" o:hrstd="t" o:hr="t" fillcolor="#a0a0a0" stroked="f"/>
+          <v:rect id="_x0000_i1029" style="width:0;height:1.5pt" o:hralign="center" o:hrstd="t" o:hr="t" fillcolor="#a0a0a0" stroked="f"/>
         </w:pict>
       </w:r>
     </w:p>
     <w:p>
       <w:pPr>
-        <w:rPr>
-          <w:b/>
-          <w:bCs/>
-          <w:lang w:val="en-US"/>
-        </w:rPr>
-      </w:pPr>
-      <w:r>
-        <w:rPr>
-          <w:b/>
-          <w:bCs/>
-          <w:lang w:val="en-US"/>
-        </w:rPr>
+        <w:spacing w:after="160" w:line="278" w:lineRule="auto"/>
+        <w:ind w:left="0" w:firstLine="0"/>
+        <w:rPr>
+          <w:b/>
+          <w:bCs/>
+          <w:lang w:val="en-US"/>
+        </w:rPr>
+      </w:pPr>
+      <w:r>
+        <w:rPr>
+          <w:b/>
+          <w:bCs/>
+          <w:lang w:val="en-US"/>
+        </w:rPr>
+        <w:br w:type="page"/>
+      </w:r>
+    </w:p>
+    <w:p>
+      <w:pPr>
+        <w:rPr>
+          <w:b/>
+          <w:bCs/>
+          <w:lang w:val="en-US"/>
+        </w:rPr>
+      </w:pPr>
+      <w:r>
+        <w:rPr>
+          <w:b/>
+          <w:bCs/>
+          <w:lang w:val="en-US"/>
+        </w:rPr>
+        <w:lastRenderedPageBreak/>
         <w:t>EDUCATION</w:t>
       </w:r>
     </w:p>
@@ -1180,7 +1251,6 @@
           <w:bCs/>
           <w:lang w:val="en-US"/>
         </w:rPr>
-        <w:lastRenderedPageBreak/>
         <w:t>Computer Science</w:t>
       </w:r>
     </w:p>
@@ -1237,7 +1307,7 @@
     <w:p>
       <w:r>
         <w:pict w14:anchorId="61591243">
-          <v:rect id="_x0000_i1066" style="width:0;height:1.5pt" o:hralign="center" o:hrstd="t" o:hr="t" fillcolor="#a0a0a0" stroked="f"/>
+          <v:rect id="_x0000_i1030" style="width:0;height:1.5pt" o:hralign="center" o:hrstd="t" o:hr="t" fillcolor="#a0a0a0" stroked="f"/>
         </w:pict>
       </w:r>
     </w:p>
@@ -1296,7 +1366,7 @@
         <w:rPr>
           <w:lang w:val="en-US"/>
         </w:rPr>
-        <w:t xml:space="preserve"> — Very good proficiency</w:t>
+        <w:t xml:space="preserve"> — good proficiency</w:t>
       </w:r>
     </w:p>
     <w:p>
@@ -2860,6 +2930,7 @@
   <w:style w:type="character" w:default="1" w:styleId="DefaultParagraphFont">
     <w:name w:val="Default Paragraph Font"/>
     <w:uiPriority w:val="1"/>
+    <w:semiHidden/>
     <w:unhideWhenUsed/>
   </w:style>
   <w:style w:type="table" w:default="1" w:styleId="TableNormal">

</xml_diff>

<commit_message>
C++ added to skills
</commit_message>
<xml_diff>
--- a/documents/Simon_Hartmann_CV.docx
+++ b/documents/Simon_Hartmann_CV.docx
@@ -162,17 +162,8 @@
             <w:rStyle w:val="Hyperlink"/>
             <w:lang w:val="en-US"/>
           </w:rPr>
-          <w:t>github.com/</w:t>
+          <w:t>github.com/SimonHartmannDev</w:t>
         </w:r>
-        <w:proofErr w:type="spellStart"/>
-        <w:r>
-          <w:rPr>
-            <w:rStyle w:val="Hyperlink"/>
-            <w:lang w:val="en-US"/>
-          </w:rPr>
-          <w:t>SimonHartmannDev</w:t>
-        </w:r>
-        <w:proofErr w:type="spellEnd"/>
       </w:hyperlink>
     </w:p>
     <w:p>
@@ -326,21 +317,7 @@
         <w:rPr>
           <w:lang w:val="en-US"/>
         </w:rPr>
-        <w:t xml:space="preserve">Implemented wave progression, multiple enemy </w:t>
-      </w:r>
-      <w:proofErr w:type="spellStart"/>
-      <w:r>
-        <w:rPr>
-          <w:lang w:val="en-US"/>
-        </w:rPr>
-        <w:t>behaviours</w:t>
-      </w:r>
-      <w:proofErr w:type="spellEnd"/>
-      <w:r>
-        <w:rPr>
-          <w:lang w:val="en-US"/>
-        </w:rPr>
-        <w:t>, vehicle combat, upgrades and progression systems.</w:t>
+        <w:t>Implemented wave progression, multiple enemy behaviours, vehicle combat, upgrades and progression systems.</w:t>
       </w:r>
     </w:p>
     <w:p>
@@ -457,21 +434,7 @@
         <w:rPr>
           <w:lang w:val="en-US"/>
         </w:rPr>
-        <w:t xml:space="preserve">Implemented local persistence for </w:t>
-      </w:r>
-      <w:proofErr w:type="spellStart"/>
-      <w:r>
-        <w:rPr>
-          <w:lang w:val="en-US"/>
-        </w:rPr>
-        <w:t>highscores</w:t>
-      </w:r>
-      <w:proofErr w:type="spellEnd"/>
-      <w:r>
-        <w:rPr>
-          <w:lang w:val="en-US"/>
-        </w:rPr>
-        <w:t>, currency and character unlocks.</w:t>
+        <w:t>Implemented local persistence for highscores, currency and character unlocks.</w:t>
       </w:r>
     </w:p>
     <w:p>
@@ -499,23 +462,13 @@
           <w:lang w:val="en-US"/>
         </w:rPr>
       </w:pPr>
-      <w:proofErr w:type="spellStart"/>
-      <w:r>
-        <w:rPr>
-          <w:b/>
-          <w:bCs/>
-          <w:lang w:val="en-US"/>
-        </w:rPr>
-        <w:t>Paruzzel</w:t>
-      </w:r>
-      <w:proofErr w:type="spellEnd"/>
-      <w:r>
-        <w:rPr>
-          <w:b/>
-          <w:bCs/>
-          <w:lang w:val="en-US"/>
-        </w:rPr>
-        <w:t xml:space="preserve"> — Gameplay Programmer</w:t>
+      <w:r>
+        <w:rPr>
+          <w:b/>
+          <w:bCs/>
+          <w:lang w:val="en-US"/>
+        </w:rPr>
+        <w:t>Paruzzel — Gameplay Programmer</w:t>
       </w:r>
     </w:p>
     <w:p>
@@ -547,21 +500,7 @@
         <w:rPr>
           <w:lang w:val="en-US"/>
         </w:rPr>
-        <w:t xml:space="preserve">Implemented first-person movement and </w:t>
-      </w:r>
-      <w:proofErr w:type="spellStart"/>
-      <w:r>
-        <w:rPr>
-          <w:lang w:val="en-US"/>
-        </w:rPr>
-        <w:t>raycast</w:t>
-      </w:r>
-      <w:proofErr w:type="spellEnd"/>
-      <w:r>
-        <w:rPr>
-          <w:lang w:val="en-US"/>
-        </w:rPr>
-        <w:t>-based interaction systems.</w:t>
+        <w:t>Implemented first-person movement and raycast-based interaction systems.</w:t>
       </w:r>
     </w:p>
     <w:p>
@@ -707,23 +646,13 @@
           <w:lang w:val="en-US"/>
         </w:rPr>
       </w:pPr>
-      <w:proofErr w:type="spellStart"/>
-      <w:r>
-        <w:rPr>
-          <w:b/>
-          <w:bCs/>
-          <w:lang w:val="en-US"/>
-        </w:rPr>
-        <w:t>KönigsNet</w:t>
-      </w:r>
-      <w:proofErr w:type="spellEnd"/>
-      <w:r>
-        <w:rPr>
-          <w:b/>
-          <w:bCs/>
-          <w:lang w:val="en-US"/>
-        </w:rPr>
-        <w:t xml:space="preserve"> e.V. · 2022 – Present</w:t>
+      <w:r>
+        <w:rPr>
+          <w:b/>
+          <w:bCs/>
+          <w:lang w:val="en-US"/>
+        </w:rPr>
+        <w:t>KönigsNet e.V. · 2022 – Present</w:t>
       </w:r>
     </w:p>
     <w:p>
@@ -901,37 +830,12 @@
           <w:bCs/>
         </w:rPr>
       </w:pPr>
-      <w:proofErr w:type="spellStart"/>
-      <w:r>
-        <w:rPr>
-          <w:b/>
-          <w:bCs/>
-        </w:rPr>
-        <w:t>Voluntary</w:t>
-      </w:r>
-      <w:proofErr w:type="spellEnd"/>
-      <w:r>
-        <w:rPr>
-          <w:b/>
-          <w:bCs/>
-        </w:rPr>
-        <w:t xml:space="preserve"> </w:t>
-      </w:r>
-      <w:proofErr w:type="spellStart"/>
-      <w:r>
-        <w:rPr>
-          <w:b/>
-          <w:bCs/>
-        </w:rPr>
-        <w:t>Social</w:t>
-      </w:r>
-      <w:proofErr w:type="spellEnd"/>
-      <w:r>
-        <w:rPr>
-          <w:b/>
-          <w:bCs/>
-        </w:rPr>
-        <w:t xml:space="preserve"> Year (FSJ)</w:t>
+      <w:r>
+        <w:rPr>
+          <w:b/>
+          <w:bCs/>
+        </w:rPr>
+        <w:t>Voluntary Social Year (FSJ)</w:t>
       </w:r>
     </w:p>
     <w:p>
@@ -957,21 +861,7 @@
         <w:rPr>
           <w:lang w:val="en-US"/>
         </w:rPr>
-        <w:t xml:space="preserve">Supported teachers with classroom and </w:t>
-      </w:r>
-      <w:proofErr w:type="spellStart"/>
-      <w:r>
-        <w:rPr>
-          <w:lang w:val="en-US"/>
-        </w:rPr>
-        <w:t>organisational</w:t>
-      </w:r>
-      <w:proofErr w:type="spellEnd"/>
-      <w:r>
-        <w:rPr>
-          <w:lang w:val="en-US"/>
-        </w:rPr>
-        <w:t xml:space="preserve"> tasks.</w:t>
+        <w:t>Supported teachers with classroom and organisational tasks.</w:t>
       </w:r>
     </w:p>
     <w:p>
@@ -1069,6 +959,24 @@
         </w:rPr>
         <w:br/>
         <w:t>C# · Java</w:t>
+      </w:r>
+      <w:r>
+        <w:rPr>
+          <w:lang w:val="en-US"/>
+        </w:rPr>
+        <w:t xml:space="preserve"> </w:t>
+      </w:r>
+      <w:r>
+        <w:rPr>
+          <w:lang w:val="en-US"/>
+        </w:rPr>
+        <w:t>·</w:t>
+      </w:r>
+      <w:r>
+        <w:rPr>
+          <w:lang w:val="en-US"/>
+        </w:rPr>
+        <w:t xml:space="preserve"> C++ (Basics)</w:t>
       </w:r>
     </w:p>
     <w:p>

</xml_diff>